<commit_message>
refined report word and pdf , add navigation to the game-analysis.html , now we have an html file to click
</commit_message>
<xml_diff>
--- a/report.docx
+++ b/report.docx
@@ -32,6 +32,7 @@
           <w:rFonts w:hint="eastAsia"/>
         </w:rPr>
       </w:pPr>
+      <w:proofErr w:type="spellStart"/>
       <w:r>
         <w:t>Part</w:t>
       </w:r>
@@ -41,6 +42,7 @@
         </w:rPr>
         <w:t>Ⅰ</w:t>
       </w:r>
+      <w:proofErr w:type="spellEnd"/>
       <w:r>
         <w:t>-</w:t>
       </w:r>
@@ -105,7 +107,31 @@
         </w:rPr>
       </w:pPr>
       <w:r>
-        <w:t>Above is the price distribution of the games in Steam , we cam see that 68.7% of the game is between $0-$15 ,it is the predominant game price of the market this is consist of old AAA games and indie games</w:t>
+        <w:t xml:space="preserve">Above is the price distribution of the games in </w:t>
+      </w:r>
+      <w:proofErr w:type="gramStart"/>
+      <w:r>
+        <w:t>Steam ,</w:t>
+      </w:r>
+      <w:proofErr w:type="gramEnd"/>
+      <w:r>
+        <w:t xml:space="preserve"> we </w:t>
+      </w:r>
+      <w:proofErr w:type="spellStart"/>
+      <w:r>
+        <w:t>cam</w:t>
+      </w:r>
+      <w:proofErr w:type="spellEnd"/>
+      <w:r>
+        <w:t xml:space="preserve"> see that 68.7% of the game is between $0-$</w:t>
+      </w:r>
+      <w:proofErr w:type="gramStart"/>
+      <w:r>
+        <w:t>15 ,it</w:t>
+      </w:r>
+      <w:proofErr w:type="gramEnd"/>
+      <w:r>
+        <w:t xml:space="preserve"> is the predominant game price of the market this is consist of old AAA games and indie games</w:t>
       </w:r>
     </w:p>
     <w:p>
@@ -167,7 +193,39 @@
         <w:t xml:space="preserve">Above is </w:t>
       </w:r>
       <w:r>
-        <w:t xml:space="preserve">the game Sales distribution , this is an estimated range , the true value is hidden inside Valve Corp , if someday I went to work with them or hack into their system I can get the real data, from this data we can see that 82.8% the game is below 20000 copies sold , these games are low quality </w:t>
+        <w:t xml:space="preserve">the game Sales </w:t>
+      </w:r>
+      <w:proofErr w:type="gramStart"/>
+      <w:r>
+        <w:t>distribution ,</w:t>
+      </w:r>
+      <w:proofErr w:type="gramEnd"/>
+      <w:r>
+        <w:t xml:space="preserve"> this is an estimated </w:t>
+      </w:r>
+      <w:proofErr w:type="gramStart"/>
+      <w:r>
+        <w:t>range ,</w:t>
+      </w:r>
+      <w:proofErr w:type="gramEnd"/>
+      <w:r>
+        <w:t xml:space="preserve"> the true value is hidden inside Valve </w:t>
+      </w:r>
+      <w:proofErr w:type="gramStart"/>
+      <w:r>
+        <w:t>Corp ,</w:t>
+      </w:r>
+      <w:proofErr w:type="gramEnd"/>
+      <w:r>
+        <w:t xml:space="preserve"> if someday I went to work with them or hack into their system I can get the real data, from this data we can see that 82.8% the game is below 20000 copies </w:t>
+      </w:r>
+      <w:proofErr w:type="gramStart"/>
+      <w:r>
+        <w:t>sold ,</w:t>
+      </w:r>
+      <w:proofErr w:type="gramEnd"/>
+      <w:r>
+        <w:t xml:space="preserve"> these games are low quality </w:t>
       </w:r>
     </w:p>
     <w:p>
@@ -238,10 +296,26 @@
         </w:rPr>
       </w:pPr>
       <w:r>
-        <w:t>Above is the age rating distribution , most of the game</w:t>
-      </w:r>
-      <w:r>
-        <w:t>(96.4%)</w:t>
+        <w:t xml:space="preserve">Above is the age rating </w:t>
+      </w:r>
+      <w:proofErr w:type="gramStart"/>
+      <w:r>
+        <w:t>distribution ,</w:t>
+      </w:r>
+      <w:proofErr w:type="gramEnd"/>
+      <w:r>
+        <w:t xml:space="preserve"> most of the </w:t>
+      </w:r>
+      <w:proofErr w:type="gramStart"/>
+      <w:r>
+        <w:t>game</w:t>
+      </w:r>
+      <w:r>
+        <w:t>(</w:t>
+      </w:r>
+      <w:proofErr w:type="gramEnd"/>
+      <w:r>
+        <w:t>96.4%)</w:t>
       </w:r>
       <w:r>
         <w:t xml:space="preserve"> is </w:t>
@@ -311,12 +385,25 @@
         </w:rPr>
       </w:pPr>
       <w:r>
-        <w:t xml:space="preserve">Above is the distribution of game achievements from there we still conclude nothing , </w:t>
+        <w:t xml:space="preserve">Above is the distribution of game achievements from there we still conclude </w:t>
+      </w:r>
+      <w:proofErr w:type="gramStart"/>
+      <w:r>
+        <w:t>nothing ,</w:t>
+      </w:r>
+      <w:proofErr w:type="gramEnd"/>
+      <w:r>
+        <w:t xml:space="preserve"> </w:t>
       </w:r>
       <w:r>
         <w:lastRenderedPageBreak/>
-        <w:t>but watch this !</w:t>
-      </w:r>
+        <w:t xml:space="preserve">but watch </w:t>
+      </w:r>
+      <w:proofErr w:type="gramStart"/>
+      <w:r>
+        <w:t>this !</w:t>
+      </w:r>
+      <w:proofErr w:type="gramEnd"/>
     </w:p>
     <w:p>
       <w:pPr>
@@ -447,12 +534,14 @@
                 <w:rFonts w:hint="eastAsia"/>
               </w:rPr>
             </w:pPr>
+            <w:proofErr w:type="spellStart"/>
             <w:r>
               <w:rPr>
                 <w:rFonts w:hint="eastAsia"/>
               </w:rPr>
               <w:t>average_playtime_forever</w:t>
             </w:r>
+            <w:proofErr w:type="spellEnd"/>
           </w:p>
         </w:tc>
         <w:tc>
@@ -567,12 +656,14 @@
                 <w:rFonts w:hint="eastAsia"/>
               </w:rPr>
             </w:pPr>
+            <w:proofErr w:type="spellStart"/>
             <w:r>
               <w:rPr>
                 <w:rFonts w:hint="eastAsia"/>
               </w:rPr>
               <w:t>metacritic_score</w:t>
             </w:r>
+            <w:proofErr w:type="spellEnd"/>
           </w:p>
         </w:tc>
         <w:tc>
@@ -704,12 +795,14 @@
                 <w:rFonts w:hint="eastAsia"/>
               </w:rPr>
             </w:pPr>
+            <w:proofErr w:type="spellStart"/>
             <w:r>
               <w:rPr>
                 <w:rFonts w:hint="eastAsia"/>
               </w:rPr>
               <w:t>metacritic_score</w:t>
             </w:r>
+            <w:proofErr w:type="spellEnd"/>
           </w:p>
         </w:tc>
         <w:tc>
@@ -758,12 +851,14 @@
                 <w:rFonts w:hint="eastAsia"/>
               </w:rPr>
             </w:pPr>
+            <w:proofErr w:type="spellStart"/>
             <w:r>
               <w:rPr>
                 <w:rFonts w:hint="eastAsia"/>
               </w:rPr>
               <w:t>average_playtime_forever</w:t>
             </w:r>
+            <w:proofErr w:type="spellEnd"/>
           </w:p>
         </w:tc>
       </w:tr>
@@ -1681,7 +1776,23 @@
           <w:b/>
           <w:bCs/>
         </w:rPr>
-        <w:t xml:space="preserve"> can see that that overall statistics grows with achievements numbers!</w:t>
+        <w:t xml:space="preserve"> can see that </w:t>
+      </w:r>
+      <w:proofErr w:type="gramStart"/>
+      <w:r>
+        <w:rPr>
+          <w:b/>
+          <w:bCs/>
+        </w:rPr>
+        <w:t>that overall statistics</w:t>
+      </w:r>
+      <w:proofErr w:type="gramEnd"/>
+      <w:r>
+        <w:rPr>
+          <w:b/>
+          <w:bCs/>
+        </w:rPr>
+        <w:t xml:space="preserve"> grows with achievements numbers!</w:t>
       </w:r>
       <w:r>
         <w:rPr>
@@ -2572,6 +2683,7 @@
         </w:rPr>
         <w:t xml:space="preserve"> game platform </w:t>
       </w:r>
+      <w:proofErr w:type="gramStart"/>
       <w:r>
         <w:t>statistics ,</w:t>
       </w:r>
@@ -2580,7 +2692,31 @@
           <w:b/>
           <w:bCs/>
         </w:rPr>
-        <w:t>we can see that games support mac are likely to support Linux because they are UNIX like system (similar commends, cod</w:t>
+        <w:t>we</w:t>
+      </w:r>
+      <w:proofErr w:type="gramEnd"/>
+      <w:r>
+        <w:rPr>
+          <w:b/>
+          <w:bCs/>
+        </w:rPr>
+        <w:t xml:space="preserve"> can see that games support mac </w:t>
+      </w:r>
+      <w:proofErr w:type="gramStart"/>
+      <w:r>
+        <w:rPr>
+          <w:b/>
+          <w:bCs/>
+        </w:rPr>
+        <w:t>are</w:t>
+      </w:r>
+      <w:proofErr w:type="gramEnd"/>
+      <w:r>
+        <w:rPr>
+          <w:b/>
+          <w:bCs/>
+        </w:rPr>
+        <w:t xml:space="preserve"> likely to support Linux because they are UNIX like system (similar commends, cod</w:t>
       </w:r>
       <w:r>
         <w:rPr>
@@ -2675,7 +2811,23 @@
           <w:b/>
           <w:bCs/>
         </w:rPr>
-        <w:t xml:space="preserve"> is the overall distribution of games’ Metacritic score ,this is clearly a </w:t>
+        <w:t xml:space="preserve"> is the overall distribution of games</w:t>
+      </w:r>
+      <w:proofErr w:type="gramStart"/>
+      <w:r>
+        <w:rPr>
+          <w:b/>
+          <w:bCs/>
+        </w:rPr>
+        <w:t>’</w:t>
+      </w:r>
+      <w:proofErr w:type="gramEnd"/>
+      <w:r>
+        <w:rPr>
+          <w:b/>
+          <w:bCs/>
+        </w:rPr>
+        <w:t xml:space="preserve"> Metacritic score ,this is clearly a </w:t>
       </w:r>
       <w:r>
         <w:rPr>
@@ -2745,6 +2897,7 @@
                 <w:bCs/>
               </w:rPr>
             </w:pPr>
+            <w:proofErr w:type="spellStart"/>
             <w:r>
               <w:rPr>
                 <w:rFonts w:hint="eastAsia"/>
@@ -2753,6 +2906,7 @@
               </w:rPr>
               <w:t>score_category</w:t>
             </w:r>
+            <w:proofErr w:type="spellEnd"/>
           </w:p>
         </w:tc>
       </w:tr>
@@ -2904,7 +3058,25 @@
                 <w:b/>
                 <w:bCs/>
               </w:rPr>
-              <w:t>Name: count, dtype: int64</w:t>
+              <w:t xml:space="preserve">Name: count, </w:t>
+            </w:r>
+            <w:proofErr w:type="spellStart"/>
+            <w:r>
+              <w:rPr>
+                <w:rFonts w:hint="eastAsia"/>
+                <w:b/>
+                <w:bCs/>
+              </w:rPr>
+              <w:t>dtype</w:t>
+            </w:r>
+            <w:proofErr w:type="spellEnd"/>
+            <w:r>
+              <w:rPr>
+                <w:rFonts w:hint="eastAsia"/>
+                <w:b/>
+                <w:bCs/>
+              </w:rPr>
+              <w:t>: int64</w:t>
             </w:r>
           </w:p>
         </w:tc>
@@ -3009,7 +3181,25 @@
           <w:b/>
           <w:bCs/>
         </w:rPr>
-        <w:t xml:space="preserve"> score ,there is a slight increase in price with </w:t>
+        <w:t xml:space="preserve"> </w:t>
+      </w:r>
+      <w:proofErr w:type="gramStart"/>
+      <w:r>
+        <w:rPr>
+          <w:rFonts w:hint="eastAsia"/>
+          <w:b/>
+          <w:bCs/>
+        </w:rPr>
+        <w:t>score ,there</w:t>
+      </w:r>
+      <w:proofErr w:type="gramEnd"/>
+      <w:r>
+        <w:rPr>
+          <w:rFonts w:hint="eastAsia"/>
+          <w:b/>
+          <w:bCs/>
+        </w:rPr>
+        <w:t xml:space="preserve"> is a slight increase in price with </w:t>
       </w:r>
       <w:r>
         <w:rPr>
@@ -3187,7 +3377,25 @@
           <w:b/>
           <w:bCs/>
         </w:rPr>
-        <w:t xml:space="preserve"> score ,as they are experts in game review </w:t>
+        <w:t xml:space="preserve"> </w:t>
+      </w:r>
+      <w:proofErr w:type="gramStart"/>
+      <w:r>
+        <w:rPr>
+          <w:rFonts w:hint="eastAsia"/>
+          <w:b/>
+          <w:bCs/>
+        </w:rPr>
+        <w:t>score ,as</w:t>
+      </w:r>
+      <w:proofErr w:type="gramEnd"/>
+      <w:r>
+        <w:rPr>
+          <w:rFonts w:hint="eastAsia"/>
+          <w:b/>
+          <w:bCs/>
+        </w:rPr>
+        <w:t xml:space="preserve"> they are experts in game review </w:t>
       </w:r>
     </w:p>
     <w:p>
@@ -3270,6 +3478,7 @@
         </w:rPr>
         <w:t xml:space="preserve">a graph for </w:t>
       </w:r>
+      <w:proofErr w:type="gramStart"/>
       <w:r>
         <w:t>reference</w:t>
       </w:r>
@@ -3277,7 +3486,28 @@
         <w:rPr>
           <w:rFonts w:hint="eastAsia"/>
         </w:rPr>
-        <w:t xml:space="preserve"> , well , </w:t>
+        <w:t xml:space="preserve"> ,</w:t>
+      </w:r>
+      <w:proofErr w:type="gramEnd"/>
+      <w:r>
+        <w:rPr>
+          <w:rFonts w:hint="eastAsia"/>
+        </w:rPr>
+        <w:t xml:space="preserve"> </w:t>
+      </w:r>
+      <w:proofErr w:type="gramStart"/>
+      <w:r>
+        <w:rPr>
+          <w:rFonts w:hint="eastAsia"/>
+        </w:rPr>
+        <w:t>well ,</w:t>
+      </w:r>
+      <w:proofErr w:type="gramEnd"/>
+      <w:r>
+        <w:rPr>
+          <w:rFonts w:hint="eastAsia"/>
+        </w:rPr>
+        <w:t xml:space="preserve"> </w:t>
       </w:r>
       <w:r>
         <w:rPr>
@@ -3349,7 +3579,43 @@
           <w:b/>
           <w:bCs/>
         </w:rPr>
-        <w:t xml:space="preserve">From above ,we can see that with the help of AI and hardware development ,the </w:t>
+        <w:t xml:space="preserve">From </w:t>
+      </w:r>
+      <w:proofErr w:type="gramStart"/>
+      <w:r>
+        <w:rPr>
+          <w:rFonts w:hint="eastAsia"/>
+          <w:b/>
+          <w:bCs/>
+        </w:rPr>
+        <w:t>above ,we</w:t>
+      </w:r>
+      <w:proofErr w:type="gramEnd"/>
+      <w:r>
+        <w:rPr>
+          <w:rFonts w:hint="eastAsia"/>
+          <w:b/>
+          <w:bCs/>
+        </w:rPr>
+        <w:t xml:space="preserve"> can see that with the help of AI and hardware </w:t>
+      </w:r>
+      <w:proofErr w:type="gramStart"/>
+      <w:r>
+        <w:rPr>
+          <w:rFonts w:hint="eastAsia"/>
+          <w:b/>
+          <w:bCs/>
+        </w:rPr>
+        <w:t>development ,the</w:t>
+      </w:r>
+      <w:proofErr w:type="gramEnd"/>
+      <w:r>
+        <w:rPr>
+          <w:rFonts w:hint="eastAsia"/>
+          <w:b/>
+          <w:bCs/>
+        </w:rPr>
+        <w:t xml:space="preserve"> </w:t>
       </w:r>
       <w:r>
         <w:rPr>
@@ -3360,6 +3626,7 @@
         <w:lastRenderedPageBreak/>
         <w:t xml:space="preserve">game releases every year is </w:t>
       </w:r>
+      <w:proofErr w:type="gramStart"/>
       <w:r>
         <w:rPr>
           <w:b/>
@@ -3373,7 +3640,16 @@
           <w:b/>
           <w:bCs/>
         </w:rPr>
-        <w:t>(the data stops at 2025 May)</w:t>
+        <w:t>(</w:t>
+      </w:r>
+      <w:proofErr w:type="gramEnd"/>
+      <w:r>
+        <w:rPr>
+          <w:rFonts w:hint="eastAsia"/>
+          <w:b/>
+          <w:bCs/>
+        </w:rPr>
+        <w:t>the data stops at 2025 May)</w:t>
       </w:r>
     </w:p>
     <w:p>
@@ -6428,13 +6704,54 @@
           <w:bCs/>
         </w:rPr>
       </w:pPr>
+      <w:proofErr w:type="gramStart"/>
       <w:r>
         <w:rPr>
           <w:b/>
           <w:bCs/>
         </w:rPr>
         <w:lastRenderedPageBreak/>
-        <w:t>Next we have genres , which is officially given by steam , here is</w:t>
+        <w:t>Next</w:t>
+      </w:r>
+      <w:proofErr w:type="gramEnd"/>
+      <w:r>
+        <w:rPr>
+          <w:b/>
+          <w:bCs/>
+        </w:rPr>
+        <w:t xml:space="preserve"> we have </w:t>
+      </w:r>
+      <w:proofErr w:type="gramStart"/>
+      <w:r>
+        <w:rPr>
+          <w:b/>
+          <w:bCs/>
+        </w:rPr>
+        <w:t>genres ,</w:t>
+      </w:r>
+      <w:proofErr w:type="gramEnd"/>
+      <w:r>
+        <w:rPr>
+          <w:b/>
+          <w:bCs/>
+        </w:rPr>
+        <w:t xml:space="preserve"> which is officially given by </w:t>
+      </w:r>
+      <w:proofErr w:type="gramStart"/>
+      <w:r>
+        <w:rPr>
+          <w:b/>
+          <w:bCs/>
+        </w:rPr>
+        <w:t>steam ,</w:t>
+      </w:r>
+      <w:proofErr w:type="gramEnd"/>
+      <w:r>
+        <w:rPr>
+          <w:b/>
+          <w:bCs/>
+        </w:rPr>
+        <w:t xml:space="preserve"> here is</w:t>
       </w:r>
       <w:r>
         <w:t xml:space="preserve"> </w:t>
@@ -6656,9 +6973,21 @@
         </w:rPr>
         <w:t xml:space="preserve"> </w:t>
       </w:r>
-      <w:r>
-        <w:t>way ,here is a tag cloud which is given by users,players</w:t>
-      </w:r>
+      <w:proofErr w:type="gramStart"/>
+      <w:r>
+        <w:t>way ,here</w:t>
+      </w:r>
+      <w:proofErr w:type="gramEnd"/>
+      <w:r>
+        <w:t xml:space="preserve"> is a tag cloud which is given by </w:t>
+      </w:r>
+      <w:proofErr w:type="spellStart"/>
+      <w:proofErr w:type="gramStart"/>
+      <w:r>
+        <w:t>users,players</w:t>
+      </w:r>
+      <w:proofErr w:type="spellEnd"/>
+      <w:proofErr w:type="gramEnd"/>
     </w:p>
     <w:p>
       <w:pPr>
@@ -6764,14 +7093,110 @@
           <w:b/>
           <w:bCs/>
         </w:rPr>
-        <w:t xml:space="preserve"> using data that is an estimated range(number of game owners),so the following graph might seemed a little bit too rectified , it is using the mid point of the range</w:t>
-      </w:r>
-      <w:r>
-        <w:rPr>
-          <w:b/>
-          <w:bCs/>
-        </w:rPr>
-        <w:t xml:space="preserve"> , </w:t>
+        <w:t xml:space="preserve"> using data that is an estimated </w:t>
+      </w:r>
+      <w:proofErr w:type="gramStart"/>
+      <w:r>
+        <w:rPr>
+          <w:b/>
+          <w:bCs/>
+        </w:rPr>
+        <w:t>range(</w:t>
+      </w:r>
+      <w:proofErr w:type="gramEnd"/>
+      <w:r>
+        <w:rPr>
+          <w:b/>
+          <w:bCs/>
+        </w:rPr>
+        <w:t>number of game owners</w:t>
+      </w:r>
+      <w:proofErr w:type="gramStart"/>
+      <w:r>
+        <w:rPr>
+          <w:b/>
+          <w:bCs/>
+        </w:rPr>
+        <w:t>),so</w:t>
+      </w:r>
+      <w:proofErr w:type="gramEnd"/>
+      <w:r>
+        <w:rPr>
+          <w:b/>
+          <w:bCs/>
+        </w:rPr>
+        <w:t xml:space="preserve"> the following graph might </w:t>
+      </w:r>
+      <w:proofErr w:type="gramStart"/>
+      <w:r>
+        <w:rPr>
+          <w:b/>
+          <w:bCs/>
+        </w:rPr>
+        <w:t>seemed</w:t>
+      </w:r>
+      <w:proofErr w:type="gramEnd"/>
+      <w:r>
+        <w:rPr>
+          <w:b/>
+          <w:bCs/>
+        </w:rPr>
+        <w:t xml:space="preserve"> a little bit too </w:t>
+      </w:r>
+      <w:proofErr w:type="gramStart"/>
+      <w:r>
+        <w:rPr>
+          <w:b/>
+          <w:bCs/>
+        </w:rPr>
+        <w:t>rectified ,</w:t>
+      </w:r>
+      <w:proofErr w:type="gramEnd"/>
+      <w:r>
+        <w:rPr>
+          <w:b/>
+          <w:bCs/>
+        </w:rPr>
+        <w:t xml:space="preserve"> it is using the </w:t>
+      </w:r>
+      <w:proofErr w:type="spellStart"/>
+      <w:r>
+        <w:rPr>
+          <w:b/>
+          <w:bCs/>
+        </w:rPr>
+        <w:t>mid point</w:t>
+      </w:r>
+      <w:proofErr w:type="spellEnd"/>
+      <w:r>
+        <w:rPr>
+          <w:b/>
+          <w:bCs/>
+        </w:rPr>
+        <w:t xml:space="preserve"> of the </w:t>
+      </w:r>
+      <w:proofErr w:type="gramStart"/>
+      <w:r>
+        <w:rPr>
+          <w:b/>
+          <w:bCs/>
+        </w:rPr>
+        <w:t>range</w:t>
+      </w:r>
+      <w:r>
+        <w:rPr>
+          <w:b/>
+          <w:bCs/>
+        </w:rPr>
+        <w:t xml:space="preserve"> ,</w:t>
+      </w:r>
+      <w:proofErr w:type="gramEnd"/>
+      <w:r>
+        <w:rPr>
+          <w:b/>
+          <w:bCs/>
+        </w:rPr>
+        <w:t xml:space="preserve"> </w:t>
       </w:r>
       <w:r>
         <w:rPr>
@@ -6981,7 +7406,25 @@
           <w:b/>
           <w:bCs/>
         </w:rPr>
-        <w:t>Adding language support does not appear to cause increased market reach.Language Support Alone is Not a Driver</w:t>
+        <w:t xml:space="preserve">Adding language support does not appear to cause increased market </w:t>
+      </w:r>
+      <w:proofErr w:type="spellStart"/>
+      <w:proofErr w:type="gramStart"/>
+      <w:r>
+        <w:rPr>
+          <w:b/>
+          <w:bCs/>
+        </w:rPr>
+        <w:t>reach.Language</w:t>
+      </w:r>
+      <w:proofErr w:type="spellEnd"/>
+      <w:proofErr w:type="gramEnd"/>
+      <w:r>
+        <w:rPr>
+          <w:b/>
+          <w:bCs/>
+        </w:rPr>
+        <w:t xml:space="preserve"> Support Alone is Not a Driver</w:t>
       </w:r>
     </w:p>
     <w:p>
@@ -6999,7 +7442,55 @@
           <w:b/>
           <w:bCs/>
         </w:rPr>
-        <w:t>For game developers before 100,000 owners, focus on other factors such as game quality ,and maybe invest in 2-3 languages(English,Chinese,Spanish)</w:t>
+        <w:t xml:space="preserve">For game developers before 100,000 owners, focus on other factors such as game </w:t>
+      </w:r>
+      <w:proofErr w:type="gramStart"/>
+      <w:r>
+        <w:rPr>
+          <w:b/>
+          <w:bCs/>
+        </w:rPr>
+        <w:t>quality ,and</w:t>
+      </w:r>
+      <w:proofErr w:type="gramEnd"/>
+      <w:r>
+        <w:rPr>
+          <w:b/>
+          <w:bCs/>
+        </w:rPr>
+        <w:t xml:space="preserve"> maybe invest in 2-3 </w:t>
+      </w:r>
+      <w:proofErr w:type="gramStart"/>
+      <w:r>
+        <w:rPr>
+          <w:b/>
+          <w:bCs/>
+        </w:rPr>
+        <w:t>languages(</w:t>
+      </w:r>
+      <w:proofErr w:type="spellStart"/>
+      <w:r>
+        <w:rPr>
+          <w:b/>
+          <w:bCs/>
+        </w:rPr>
+        <w:t>English,Chinese</w:t>
+      </w:r>
+      <w:proofErr w:type="gramEnd"/>
+      <w:r>
+        <w:rPr>
+          <w:b/>
+          <w:bCs/>
+        </w:rPr>
+        <w:t>,Spanish</w:t>
+      </w:r>
+      <w:proofErr w:type="spellEnd"/>
+      <w:r>
+        <w:rPr>
+          <w:b/>
+          <w:bCs/>
+        </w:rPr>
+        <w:t>)</w:t>
       </w:r>
     </w:p>
     <w:p>
@@ -7017,7 +7508,23 @@
           <w:b/>
           <w:bCs/>
         </w:rPr>
-        <w:t>For games with over 100,000 owners, investing in more languages(find which languages have more audience) can help reach a wider audience</w:t>
+        <w:t xml:space="preserve">For games with over 100,000 owners, investing in more </w:t>
+      </w:r>
+      <w:proofErr w:type="gramStart"/>
+      <w:r>
+        <w:rPr>
+          <w:b/>
+          <w:bCs/>
+        </w:rPr>
+        <w:t>languages(</w:t>
+      </w:r>
+      <w:proofErr w:type="gramEnd"/>
+      <w:r>
+        <w:rPr>
+          <w:b/>
+          <w:bCs/>
+        </w:rPr>
+        <w:t>find which languages have more audience) can help reach a wider audience</w:t>
       </w:r>
     </w:p>
     <w:p>
@@ -9124,13 +9631,51 @@
           <w:color w:val="333333"/>
         </w:rPr>
       </w:pPr>
+      <w:proofErr w:type="spellStart"/>
       <w:r>
         <w:rPr>
           <w:rStyle w:val="HTML1"/>
           <w:rFonts w:ascii="Courier New" w:hAnsi="Courier New" w:cs="Courier New"/>
           <w:color w:val="333333"/>
         </w:rPr>
-        <w:t>owner_audio_prop = df_clean.groupby(</w:t>
+        <w:t>owner_audio_prop</w:t>
+      </w:r>
+      <w:proofErr w:type="spellEnd"/>
+      <w:r>
+        <w:rPr>
+          <w:rStyle w:val="HTML1"/>
+          <w:rFonts w:ascii="Courier New" w:hAnsi="Courier New" w:cs="Courier New"/>
+          <w:color w:val="333333"/>
+        </w:rPr>
+        <w:t xml:space="preserve"> = </w:t>
+      </w:r>
+      <w:proofErr w:type="spellStart"/>
+      <w:r>
+        <w:rPr>
+          <w:rStyle w:val="HTML1"/>
+          <w:rFonts w:ascii="Courier New" w:hAnsi="Courier New" w:cs="Courier New"/>
+          <w:color w:val="333333"/>
+        </w:rPr>
+        <w:t>df_</w:t>
+      </w:r>
+      <w:proofErr w:type="gramStart"/>
+      <w:r>
+        <w:rPr>
+          <w:rStyle w:val="HTML1"/>
+          <w:rFonts w:ascii="Courier New" w:hAnsi="Courier New" w:cs="Courier New"/>
+          <w:color w:val="333333"/>
+        </w:rPr>
+        <w:t>clean.groupby</w:t>
+      </w:r>
+      <w:proofErr w:type="spellEnd"/>
+      <w:proofErr w:type="gramEnd"/>
+      <w:r>
+        <w:rPr>
+          <w:rStyle w:val="HTML1"/>
+          <w:rFonts w:ascii="Courier New" w:hAnsi="Courier New" w:cs="Courier New"/>
+          <w:color w:val="333333"/>
+        </w:rPr>
+        <w:t>(</w:t>
       </w:r>
       <w:r>
         <w:rPr>
@@ -9138,7 +9683,25 @@
           <w:rFonts w:ascii="Courier New" w:hAnsi="Courier New" w:cs="Courier New"/>
           <w:color w:val="2AA198"/>
         </w:rPr>
-        <w:t>'owner_category'</w:t>
+        <w:t>'</w:t>
+      </w:r>
+      <w:proofErr w:type="spellStart"/>
+      <w:r>
+        <w:rPr>
+          <w:rStyle w:val="hljs-string"/>
+          <w:rFonts w:ascii="Courier New" w:hAnsi="Courier New" w:cs="Courier New"/>
+          <w:color w:val="2AA198"/>
+        </w:rPr>
+        <w:t>owner_category</w:t>
+      </w:r>
+      <w:proofErr w:type="spellEnd"/>
+      <w:r>
+        <w:rPr>
+          <w:rStyle w:val="hljs-string"/>
+          <w:rFonts w:ascii="Courier New" w:hAnsi="Courier New" w:cs="Courier New"/>
+          <w:color w:val="2AA198"/>
+        </w:rPr>
+        <w:t>'</w:t>
       </w:r>
       <w:r>
         <w:rPr>
@@ -9148,6 +9711,7 @@
         </w:rPr>
         <w:t>, observed=</w:t>
       </w:r>
+      <w:proofErr w:type="gramStart"/>
       <w:r>
         <w:rPr>
           <w:rStyle w:val="hljs-keyword"/>
@@ -9164,21 +9728,50 @@
         </w:rPr>
         <w:t>)[</w:t>
       </w:r>
+      <w:proofErr w:type="gramEnd"/>
       <w:r>
         <w:rPr>
           <w:rStyle w:val="hljs-string"/>
           <w:rFonts w:ascii="Courier New" w:hAnsi="Courier New" w:cs="Courier New"/>
           <w:color w:val="2AA198"/>
         </w:rPr>
-        <w:t>'has_full_audio'</w:t>
-      </w:r>
+        <w:t>'</w:t>
+      </w:r>
+      <w:proofErr w:type="spellStart"/>
+      <w:r>
+        <w:rPr>
+          <w:rStyle w:val="hljs-string"/>
+          <w:rFonts w:ascii="Courier New" w:hAnsi="Courier New" w:cs="Courier New"/>
+          <w:color w:val="2AA198"/>
+        </w:rPr>
+        <w:t>has_full_audio</w:t>
+      </w:r>
+      <w:proofErr w:type="spellEnd"/>
+      <w:r>
+        <w:rPr>
+          <w:rStyle w:val="hljs-string"/>
+          <w:rFonts w:ascii="Courier New" w:hAnsi="Courier New" w:cs="Courier New"/>
+          <w:color w:val="2AA198"/>
+        </w:rPr>
+        <w:t>'</w:t>
+      </w:r>
+      <w:proofErr w:type="gramStart"/>
       <w:r>
         <w:rPr>
           <w:rStyle w:val="HTML1"/>
           <w:rFonts w:ascii="Courier New" w:hAnsi="Courier New" w:cs="Courier New"/>
           <w:color w:val="333333"/>
         </w:rPr>
-        <w:t>].mean()</w:t>
+        <w:t>].mean</w:t>
+      </w:r>
+      <w:proofErr w:type="gramEnd"/>
+      <w:r>
+        <w:rPr>
+          <w:rStyle w:val="HTML1"/>
+          <w:rFonts w:ascii="Courier New" w:hAnsi="Courier New" w:cs="Courier New"/>
+          <w:color w:val="333333"/>
+        </w:rPr>
+        <w:t>()</w:t>
       </w:r>
     </w:p>
     <w:p>
@@ -9413,13 +10006,59 @@
           <w:color w:val="333333"/>
         </w:rPr>
       </w:pPr>
+      <w:proofErr w:type="spellStart"/>
       <w:r>
         <w:rPr>
           <w:rStyle w:val="HTML1"/>
           <w:rFonts w:ascii="Courier New" w:hAnsi="Courier New" w:cs="Courier New"/>
           <w:color w:val="333333"/>
         </w:rPr>
-        <w:t>genre_audio_stats_filtered = genre_audio_stats[genre_audio_stats[</w:t>
+        <w:t>genre_audio_stats_filtered</w:t>
+      </w:r>
+      <w:proofErr w:type="spellEnd"/>
+      <w:r>
+        <w:rPr>
+          <w:rStyle w:val="HTML1"/>
+          <w:rFonts w:ascii="Courier New" w:hAnsi="Courier New" w:cs="Courier New"/>
+          <w:color w:val="333333"/>
+        </w:rPr>
+        <w:t xml:space="preserve"> = </w:t>
+      </w:r>
+      <w:proofErr w:type="spellStart"/>
+      <w:r>
+        <w:rPr>
+          <w:rStyle w:val="HTML1"/>
+          <w:rFonts w:ascii="Courier New" w:hAnsi="Courier New" w:cs="Courier New"/>
+          <w:color w:val="333333"/>
+        </w:rPr>
+        <w:t>genre_audio_stats</w:t>
+      </w:r>
+      <w:proofErr w:type="spellEnd"/>
+      <w:r>
+        <w:rPr>
+          <w:rStyle w:val="HTML1"/>
+          <w:rFonts w:ascii="Courier New" w:hAnsi="Courier New" w:cs="Courier New"/>
+          <w:color w:val="333333"/>
+        </w:rPr>
+        <w:t>[</w:t>
+      </w:r>
+      <w:proofErr w:type="spellStart"/>
+      <w:r>
+        <w:rPr>
+          <w:rStyle w:val="HTML1"/>
+          <w:rFonts w:ascii="Courier New" w:hAnsi="Courier New" w:cs="Courier New"/>
+          <w:color w:val="333333"/>
+        </w:rPr>
+        <w:t>genre_audio_stats</w:t>
+      </w:r>
+      <w:proofErr w:type="spellEnd"/>
+      <w:r>
+        <w:rPr>
+          <w:rStyle w:val="HTML1"/>
+          <w:rFonts w:ascii="Courier New" w:hAnsi="Courier New" w:cs="Courier New"/>
+          <w:color w:val="333333"/>
+        </w:rPr>
+        <w:t>[</w:t>
       </w:r>
       <w:r>
         <w:rPr>
@@ -9445,14 +10084,52 @@
         </w:rPr>
         <w:t>100</w:t>
       </w:r>
+      <w:proofErr w:type="gramStart"/>
       <w:r>
         <w:rPr>
           <w:rStyle w:val="HTML1"/>
           <w:rFonts w:ascii="Courier New" w:hAnsi="Courier New" w:cs="Courier New"/>
           <w:color w:val="333333"/>
         </w:rPr>
-        <w:t>].sort_values(</w:t>
-      </w:r>
+        <w:t>].</w:t>
+      </w:r>
+      <w:proofErr w:type="spellStart"/>
+      <w:r>
+        <w:rPr>
+          <w:rStyle w:val="HTML1"/>
+          <w:rFonts w:ascii="Courier New" w:hAnsi="Courier New" w:cs="Courier New"/>
+          <w:color w:val="333333"/>
+        </w:rPr>
+        <w:t>sort</w:t>
+      </w:r>
+      <w:proofErr w:type="gramEnd"/>
+      <w:r>
+        <w:rPr>
+          <w:rStyle w:val="HTML1"/>
+          <w:rFonts w:ascii="Courier New" w:hAnsi="Courier New" w:cs="Courier New"/>
+          <w:color w:val="333333"/>
+        </w:rPr>
+        <w:t>_</w:t>
+      </w:r>
+      <w:proofErr w:type="gramStart"/>
+      <w:r>
+        <w:rPr>
+          <w:rStyle w:val="HTML1"/>
+          <w:rFonts w:ascii="Courier New" w:hAnsi="Courier New" w:cs="Courier New"/>
+          <w:color w:val="333333"/>
+        </w:rPr>
+        <w:t>values</w:t>
+      </w:r>
+      <w:proofErr w:type="spellEnd"/>
+      <w:r>
+        <w:rPr>
+          <w:rStyle w:val="HTML1"/>
+          <w:rFonts w:ascii="Courier New" w:hAnsi="Courier New" w:cs="Courier New"/>
+          <w:color w:val="333333"/>
+        </w:rPr>
+        <w:t>(</w:t>
+      </w:r>
+      <w:proofErr w:type="gramEnd"/>
       <w:r>
         <w:rPr>
           <w:rStyle w:val="hljs-string"/>
@@ -10310,44 +10987,6 @@
       </w:pPr>
       <w:r>
         <w:rPr>
-          <w:rFonts w:hint="eastAsia"/>
-          <w:b/>
-          <w:bCs/>
-        </w:rPr>
-        <w:t>Well</w:t>
-      </w:r>
-      <w:r>
-        <w:rPr>
-          <w:b/>
-          <w:bCs/>
-        </w:rPr>
-        <w:t xml:space="preserve"> , I must have to say there is a lot of analysis I have done , but they don’t have decisive factors , or they are simply finding some particular games (such as Polarizing </w:t>
-      </w:r>
-      <w:r>
-        <w:rPr>
-          <w:b/>
-          <w:bCs/>
-        </w:rPr>
-        <w:t xml:space="preserve">Review Games, which is games that have both tremendous positive review and negative review </w:t>
-      </w:r>
-      <w:r>
-        <w:rPr>
-          <w:b/>
-          <w:bCs/>
-        </w:rPr>
-        <w:t>)</w:t>
-      </w:r>
-    </w:p>
-    <w:p>
-      <w:pPr>
-        <w:rPr>
-          <w:rFonts w:hint="eastAsia"/>
-          <w:b/>
-          <w:bCs/>
-        </w:rPr>
-      </w:pPr>
-      <w:r>
-        <w:rPr>
           <w:b/>
           <w:bCs/>
         </w:rPr>
@@ -10366,7 +11005,23 @@
           <w:b/>
           <w:bCs/>
         </w:rPr>
-        <w:t xml:space="preserve"> of these negative review is about BUG,Price,Game optimization</w:t>
+        <w:t xml:space="preserve"> of these negative review is about </w:t>
+      </w:r>
+      <w:proofErr w:type="spellStart"/>
+      <w:r>
+        <w:rPr>
+          <w:b/>
+          <w:bCs/>
+        </w:rPr>
+        <w:t>BUG,Price,Game</w:t>
+      </w:r>
+      <w:proofErr w:type="spellEnd"/>
+      <w:r>
+        <w:rPr>
+          <w:b/>
+          <w:bCs/>
+        </w:rPr>
+        <w:t xml:space="preserve"> optimization</w:t>
       </w:r>
     </w:p>
     <w:p>
@@ -10432,25 +11087,516 @@
     <w:p>
       <w:pPr>
         <w:rPr>
-          <w:rFonts w:hint="eastAsia"/>
-          <w:b/>
-          <w:bCs/>
-        </w:rPr>
-      </w:pPr>
-      <w:r>
-        <w:rPr>
           <w:b/>
           <w:bCs/>
           <w:highlight w:val="yellow"/>
         </w:rPr>
-        <w:t>And for the rest of the analysis you can check inside my jupyter</w:t>
-      </w:r>
-      <w:r>
-        <w:rPr>
+      </w:pPr>
+      <w:r>
+        <w:rPr>
+          <w:rFonts w:hint="eastAsia"/>
           <w:b/>
           <w:bCs/>
           <w:highlight w:val="yellow"/>
         </w:rPr>
+        <w:t>Here are</w:t>
+      </w:r>
+      <w:r>
+        <w:rPr>
+          <w:b/>
+          <w:bCs/>
+          <w:highlight w:val="yellow"/>
+        </w:rPr>
+        <w:t xml:space="preserve"> also</w:t>
+      </w:r>
+      <w:r>
+        <w:rPr>
+          <w:rFonts w:hint="eastAsia"/>
+          <w:b/>
+          <w:bCs/>
+          <w:highlight w:val="yellow"/>
+        </w:rPr>
+        <w:t xml:space="preserve"> some</w:t>
+      </w:r>
+      <w:r>
+        <w:rPr>
+          <w:b/>
+          <w:bCs/>
+          <w:highlight w:val="yellow"/>
+        </w:rPr>
+        <w:t xml:space="preserve"> findings from my </w:t>
+      </w:r>
+      <w:proofErr w:type="spellStart"/>
+      <w:r>
+        <w:rPr>
+          <w:b/>
+          <w:bCs/>
+          <w:highlight w:val="yellow"/>
+        </w:rPr>
+        <w:t>jupyter</w:t>
+      </w:r>
+      <w:proofErr w:type="spellEnd"/>
+      <w:r>
+        <w:rPr>
+          <w:b/>
+          <w:bCs/>
+          <w:highlight w:val="yellow"/>
+        </w:rPr>
+        <w:t xml:space="preserve"> notebook</w:t>
+      </w:r>
+    </w:p>
+    <w:p>
+      <w:pPr>
+        <w:rPr>
+          <w:b/>
+          <w:bCs/>
+          <w:highlight w:val="yellow"/>
+        </w:rPr>
+      </w:pPr>
+      <w:r>
+        <w:rPr>
+          <w:b/>
+          <w:bCs/>
+          <w:highlight w:val="yellow"/>
+        </w:rPr>
+        <w:t>1</w:t>
+      </w:r>
+      <w:r>
+        <w:rPr>
+          <w:b/>
+          <w:bCs/>
+          <w:highlight w:val="yellow"/>
+        </w:rPr>
+        <w:t xml:space="preserve">. **There is an increasing trend between </w:t>
+      </w:r>
+      <w:proofErr w:type="spellStart"/>
+      <w:r>
+        <w:rPr>
+          <w:b/>
+          <w:bCs/>
+          <w:highlight w:val="yellow"/>
+        </w:rPr>
+        <w:t>metacritic_score</w:t>
+      </w:r>
+      <w:proofErr w:type="spellEnd"/>
+      <w:r>
+        <w:rPr>
+          <w:b/>
+          <w:bCs/>
+          <w:highlight w:val="yellow"/>
+        </w:rPr>
+        <w:t xml:space="preserve"> and price. The games with higher </w:t>
+      </w:r>
+      <w:proofErr w:type="spellStart"/>
+      <w:r>
+        <w:rPr>
+          <w:b/>
+          <w:bCs/>
+          <w:highlight w:val="yellow"/>
+        </w:rPr>
+        <w:t>metacritic_score</w:t>
+      </w:r>
+      <w:proofErr w:type="spellEnd"/>
+      <w:r>
+        <w:rPr>
+          <w:b/>
+          <w:bCs/>
+          <w:highlight w:val="yellow"/>
+        </w:rPr>
+        <w:t xml:space="preserve"> are more likely to be expensive. And it is likely that the games with higher </w:t>
+      </w:r>
+      <w:proofErr w:type="spellStart"/>
+      <w:r>
+        <w:rPr>
+          <w:b/>
+          <w:bCs/>
+          <w:highlight w:val="yellow"/>
+        </w:rPr>
+        <w:t>metacritic_score</w:t>
+      </w:r>
+      <w:proofErr w:type="spellEnd"/>
+      <w:r>
+        <w:rPr>
+          <w:b/>
+          <w:bCs/>
+          <w:highlight w:val="yellow"/>
+        </w:rPr>
+        <w:t xml:space="preserve"> </w:t>
+      </w:r>
+      <w:proofErr w:type="gramStart"/>
+      <w:r>
+        <w:rPr>
+          <w:b/>
+          <w:bCs/>
+          <w:highlight w:val="yellow"/>
+        </w:rPr>
+        <w:t>has</w:t>
+      </w:r>
+      <w:proofErr w:type="gramEnd"/>
+      <w:r>
+        <w:rPr>
+          <w:b/>
+          <w:bCs/>
+          <w:highlight w:val="yellow"/>
+        </w:rPr>
+        <w:t xml:space="preserve"> a high </w:t>
+      </w:r>
+      <w:proofErr w:type="spellStart"/>
+      <w:r>
+        <w:rPr>
+          <w:b/>
+          <w:bCs/>
+          <w:highlight w:val="yellow"/>
+        </w:rPr>
+        <w:t>postive</w:t>
+      </w:r>
+      <w:proofErr w:type="spellEnd"/>
+      <w:r>
+        <w:rPr>
+          <w:b/>
+          <w:bCs/>
+          <w:highlight w:val="yellow"/>
+        </w:rPr>
+        <w:t xml:space="preserve"> </w:t>
+      </w:r>
+      <w:proofErr w:type="spellStart"/>
+      <w:proofErr w:type="gramStart"/>
+      <w:r>
+        <w:rPr>
+          <w:b/>
+          <w:bCs/>
+          <w:highlight w:val="yellow"/>
+        </w:rPr>
+        <w:t>ratio.They</w:t>
+      </w:r>
+      <w:proofErr w:type="spellEnd"/>
+      <w:proofErr w:type="gramEnd"/>
+      <w:r>
+        <w:rPr>
+          <w:b/>
+          <w:bCs/>
+          <w:highlight w:val="yellow"/>
+        </w:rPr>
+        <w:t xml:space="preserve"> are </w:t>
+      </w:r>
+      <w:proofErr w:type="spellStart"/>
+      <w:r>
+        <w:rPr>
+          <w:b/>
+          <w:bCs/>
+          <w:highlight w:val="yellow"/>
+        </w:rPr>
+        <w:t>postively</w:t>
+      </w:r>
+      <w:proofErr w:type="spellEnd"/>
+      <w:r>
+        <w:rPr>
+          <w:b/>
+          <w:bCs/>
+          <w:highlight w:val="yellow"/>
+        </w:rPr>
+        <w:t xml:space="preserve"> correlated (It means the official score will influence the public </w:t>
+      </w:r>
+      <w:proofErr w:type="gramStart"/>
+      <w:r>
+        <w:rPr>
+          <w:b/>
+          <w:bCs/>
+          <w:highlight w:val="yellow"/>
+        </w:rPr>
+        <w:t>opinion)*</w:t>
+      </w:r>
+      <w:proofErr w:type="gramEnd"/>
+      <w:r>
+        <w:rPr>
+          <w:b/>
+          <w:bCs/>
+          <w:highlight w:val="yellow"/>
+        </w:rPr>
+        <w:t>*</w:t>
+      </w:r>
+      <w:r>
+        <w:rPr>
+          <w:b/>
+          <w:bCs/>
+          <w:highlight w:val="yellow"/>
+        </w:rPr>
+        <w:br/>
+      </w:r>
+      <w:r>
+        <w:rPr>
+          <w:b/>
+          <w:bCs/>
+          <w:highlight w:val="yellow"/>
+        </w:rPr>
+        <w:t>2</w:t>
+      </w:r>
+      <w:r>
+        <w:rPr>
+          <w:b/>
+          <w:bCs/>
+          <w:highlight w:val="yellow"/>
+        </w:rPr>
+        <w:t xml:space="preserve">. **Top 3 genre by estimated revenue are Action, Adventure, and </w:t>
+      </w:r>
+      <w:proofErr w:type="gramStart"/>
+      <w:r>
+        <w:rPr>
+          <w:b/>
+          <w:bCs/>
+          <w:highlight w:val="yellow"/>
+        </w:rPr>
+        <w:t>RPG.*</w:t>
+      </w:r>
+      <w:proofErr w:type="gramEnd"/>
+      <w:r>
+        <w:rPr>
+          <w:b/>
+          <w:bCs/>
+          <w:highlight w:val="yellow"/>
+        </w:rPr>
+        <w:t>*</w:t>
+      </w:r>
+      <w:r>
+        <w:rPr>
+          <w:b/>
+          <w:bCs/>
+          <w:highlight w:val="yellow"/>
+        </w:rPr>
+        <w:br/>
+      </w:r>
+      <w:r>
+        <w:rPr>
+          <w:b/>
+          <w:bCs/>
+          <w:highlight w:val="yellow"/>
+        </w:rPr>
+        <w:t>3</w:t>
+      </w:r>
+      <w:r>
+        <w:rPr>
+          <w:b/>
+          <w:bCs/>
+          <w:highlight w:val="yellow"/>
+        </w:rPr>
+        <w:t xml:space="preserve">. **The games with mac support </w:t>
+      </w:r>
+      <w:proofErr w:type="gramStart"/>
+      <w:r>
+        <w:rPr>
+          <w:b/>
+          <w:bCs/>
+          <w:highlight w:val="yellow"/>
+        </w:rPr>
+        <w:t>is</w:t>
+      </w:r>
+      <w:proofErr w:type="gramEnd"/>
+      <w:r>
+        <w:rPr>
+          <w:b/>
+          <w:bCs/>
+          <w:highlight w:val="yellow"/>
+        </w:rPr>
+        <w:t xml:space="preserve"> likely to also support Linux because they are all </w:t>
+      </w:r>
+      <w:proofErr w:type="spellStart"/>
+      <w:r>
+        <w:rPr>
+          <w:b/>
+          <w:bCs/>
+          <w:highlight w:val="yellow"/>
+        </w:rPr>
+        <w:t>unix</w:t>
+      </w:r>
+      <w:proofErr w:type="spellEnd"/>
+      <w:r>
+        <w:rPr>
+          <w:b/>
+          <w:bCs/>
+          <w:highlight w:val="yellow"/>
+        </w:rPr>
+        <w:t xml:space="preserve"> like system**</w:t>
+      </w:r>
+      <w:r>
+        <w:rPr>
+          <w:b/>
+          <w:bCs/>
+          <w:highlight w:val="yellow"/>
+        </w:rPr>
+        <w:br/>
+      </w:r>
+      <w:r>
+        <w:rPr>
+          <w:b/>
+          <w:bCs/>
+          <w:highlight w:val="yellow"/>
+        </w:rPr>
+        <w:t>4</w:t>
+      </w:r>
+      <w:r>
+        <w:rPr>
+          <w:b/>
+          <w:bCs/>
+          <w:highlight w:val="yellow"/>
+        </w:rPr>
+        <w:t>. **Each year the number of game release is increasing due to tech development and AI**</w:t>
+      </w:r>
+      <w:r>
+        <w:rPr>
+          <w:b/>
+          <w:bCs/>
+          <w:highlight w:val="yellow"/>
+        </w:rPr>
+        <w:br/>
+      </w:r>
+      <w:r>
+        <w:rPr>
+          <w:b/>
+          <w:bCs/>
+          <w:highlight w:val="yellow"/>
+        </w:rPr>
+        <w:t>5</w:t>
+      </w:r>
+      <w:r>
+        <w:rPr>
+          <w:b/>
+          <w:bCs/>
+          <w:highlight w:val="yellow"/>
+        </w:rPr>
+        <w:t>. **The average playtime grows with age of the game , this is through a combination of content accumulation , player community development(</w:t>
+      </w:r>
+      <w:proofErr w:type="spellStart"/>
+      <w:r>
+        <w:rPr>
+          <w:b/>
+          <w:bCs/>
+          <w:highlight w:val="yellow"/>
+        </w:rPr>
+        <w:t>mods,hardcore</w:t>
+      </w:r>
+      <w:proofErr w:type="spellEnd"/>
+      <w:r>
+        <w:rPr>
+          <w:b/>
+          <w:bCs/>
+          <w:highlight w:val="yellow"/>
+        </w:rPr>
+        <w:t xml:space="preserve"> play method) , player screening effects(Survivorship </w:t>
+      </w:r>
+      <w:proofErr w:type="spellStart"/>
+      <w:r>
+        <w:rPr>
+          <w:b/>
+          <w:bCs/>
+          <w:highlight w:val="yellow"/>
+        </w:rPr>
+        <w:t>bias,only</w:t>
+      </w:r>
+      <w:proofErr w:type="spellEnd"/>
+      <w:r>
+        <w:rPr>
+          <w:b/>
+          <w:bCs/>
+          <w:highlight w:val="yellow"/>
+        </w:rPr>
+        <w:t xml:space="preserve"> those who are interested in the games remain to play the </w:t>
+      </w:r>
+      <w:proofErr w:type="spellStart"/>
+      <w:r>
+        <w:rPr>
+          <w:b/>
+          <w:bCs/>
+          <w:highlight w:val="yellow"/>
+        </w:rPr>
+        <w:t>game,the</w:t>
+      </w:r>
+      <w:proofErr w:type="spellEnd"/>
+      <w:r>
+        <w:rPr>
+          <w:b/>
+          <w:bCs/>
+          <w:highlight w:val="yellow"/>
+        </w:rPr>
+        <w:t xml:space="preserve"> </w:t>
+      </w:r>
+      <w:r>
+        <w:rPr>
+          <w:b/>
+          <w:bCs/>
+          <w:highlight w:val="yellow"/>
+        </w:rPr>
+        <w:lastRenderedPageBreak/>
+        <w:t>hardcore players),the games of older age are tend to be more stable , less bugs , and players have more emotional investment and sunk cost.**</w:t>
+      </w:r>
+    </w:p>
+    <w:p>
+      <w:pPr>
+        <w:rPr>
+          <w:rFonts w:hint="eastAsia"/>
+          <w:b/>
+          <w:bCs/>
+          <w:highlight w:val="yellow"/>
+        </w:rPr>
+      </w:pPr>
+    </w:p>
+    <w:p>
+      <w:pPr>
+        <w:rPr>
+          <w:rFonts w:hint="eastAsia"/>
+          <w:b/>
+          <w:bCs/>
+        </w:rPr>
+      </w:pPr>
+      <w:r>
+        <w:rPr>
+          <w:b/>
+          <w:bCs/>
+          <w:highlight w:val="yellow"/>
+        </w:rPr>
+        <w:t xml:space="preserve">And for the rest of the </w:t>
+      </w:r>
+      <w:proofErr w:type="gramStart"/>
+      <w:r>
+        <w:rPr>
+          <w:b/>
+          <w:bCs/>
+          <w:highlight w:val="yellow"/>
+        </w:rPr>
+        <w:t>analysis</w:t>
+      </w:r>
+      <w:proofErr w:type="gramEnd"/>
+      <w:r>
+        <w:rPr>
+          <w:b/>
+          <w:bCs/>
+          <w:highlight w:val="yellow"/>
+        </w:rPr>
+        <w:t xml:space="preserve"> you can check inside my </w:t>
+      </w:r>
+      <w:proofErr w:type="spellStart"/>
+      <w:r>
+        <w:rPr>
+          <w:b/>
+          <w:bCs/>
+          <w:highlight w:val="yellow"/>
+        </w:rPr>
+        <w:t>jupyter</w:t>
+      </w:r>
+      <w:proofErr w:type="spellEnd"/>
+      <w:r>
+        <w:rPr>
+          <w:b/>
+          <w:bCs/>
+          <w:highlight w:val="yellow"/>
+        </w:rPr>
+        <w:t xml:space="preserve"> </w:t>
+      </w:r>
+      <w:r>
+        <w:rPr>
+          <w:b/>
+          <w:bCs/>
+          <w:highlight w:val="yellow"/>
+        </w:rPr>
         <w:t>n</w:t>
       </w:r>
       <w:r>
@@ -10497,33 +11643,39 @@
         </w:rPr>
       </w:pPr>
     </w:p>
-    <w:p>
-      <w:pPr>
-        <w:rPr>
-          <w:rFonts w:hint="eastAsia"/>
-        </w:rPr>
-      </w:pPr>
-    </w:p>
-    <w:p>
-      <w:pPr>
-        <w:rPr>
-          <w:rFonts w:hint="eastAsia"/>
-        </w:rPr>
-      </w:pPr>
-    </w:p>
-    <w:p>
-      <w:pPr>
-        <w:rPr>
-          <w:rFonts w:eastAsiaTheme="minorHAnsi" w:hint="eastAsia"/>
-          <w:b/>
-          <w:bCs/>
-        </w:rPr>
-      </w:pPr>
-      <w:r>
-        <w:rPr>
-          <w:b/>
-          <w:bCs/>
-        </w:rPr>
+    <w:p/>
+    <w:p/>
+    <w:p/>
+    <w:p/>
+    <w:p/>
+    <w:p/>
+    <w:p/>
+    <w:p/>
+    <w:p/>
+    <w:p/>
+    <w:p/>
+    <w:p/>
+    <w:p/>
+    <w:p/>
+    <w:p/>
+    <w:p/>
+    <w:p/>
+    <w:p/>
+    <w:p>
+      <w:pPr>
+        <w:rPr>
+          <w:rFonts w:eastAsiaTheme="minorHAnsi"/>
+          <w:b/>
+          <w:bCs/>
+        </w:rPr>
+      </w:pPr>
+      <w:proofErr w:type="spellStart"/>
+      <w:r>
+        <w:rPr>
+          <w:b/>
+          <w:bCs/>
+        </w:rPr>
+        <w:lastRenderedPageBreak/>
         <w:t>Part</w:t>
       </w:r>
       <w:r>
@@ -10534,6 +11686,7 @@
         </w:rPr>
         <w:t>Ⅲ</w:t>
       </w:r>
+      <w:proofErr w:type="spellEnd"/>
       <w:r>
         <w:rPr>
           <w:rFonts w:eastAsiaTheme="minorHAnsi"/>
@@ -10541,70 +11694,6 @@
           <w:bCs/>
         </w:rPr>
         <w:t>-A comprehensive evaluation metric of games</w:t>
-      </w:r>
-    </w:p>
-    <w:p>
-      <w:pPr>
-        <w:jc w:val="center"/>
-        <w:rPr>
-          <w:rFonts w:hint="eastAsia"/>
-          <w:b/>
-          <w:bCs/>
-        </w:rPr>
-      </w:pPr>
-      <w:r>
-        <w:rPr>
-          <w:noProof/>
-        </w:rPr>
-        <w:lastRenderedPageBreak/>
-        <w:drawing>
-          <wp:inline distT="0" distB="0" distL="0" distR="0" wp14:anchorId="5968CFB2" wp14:editId="61427A38">
-            <wp:extent cx="987559" cy="8374456"/>
-            <wp:effectExtent l="0" t="0" r="3175" b="7620"/>
-            <wp:docPr id="1694410063" name="图片 3"/>
-            <wp:cNvGraphicFramePr>
-              <a:graphicFrameLocks xmlns:a="http://schemas.openxmlformats.org/drawingml/2006/main" noChangeAspect="1"/>
-            </wp:cNvGraphicFramePr>
-            <a:graphic xmlns:a="http://schemas.openxmlformats.org/drawingml/2006/main">
-              <a:graphicData uri="http://schemas.openxmlformats.org/drawingml/2006/picture">
-                <pic:pic xmlns:pic="http://schemas.openxmlformats.org/drawingml/2006/picture">
-                  <pic:nvPicPr>
-                    <pic:cNvPr id="0" name="Picture 7"/>
-                    <pic:cNvPicPr>
-                      <a:picLocks noChangeAspect="1" noChangeArrowheads="1"/>
-                    </pic:cNvPicPr>
-                  </pic:nvPicPr>
-                  <pic:blipFill>
-                    <a:blip r:embed="rId34" cstate="print">
-                      <a:extLst>
-                        <a:ext uri="{28A0092B-C50C-407E-A947-70E740481C1C}">
-                          <a14:useLocalDpi xmlns:a14="http://schemas.microsoft.com/office/drawing/2010/main" val="0"/>
-                        </a:ext>
-                      </a:extLst>
-                    </a:blip>
-                    <a:srcRect/>
-                    <a:stretch>
-                      <a:fillRect/>
-                    </a:stretch>
-                  </pic:blipFill>
-                  <pic:spPr bwMode="auto">
-                    <a:xfrm>
-                      <a:off x="0" y="0"/>
-                      <a:ext cx="992348" cy="8415064"/>
-                    </a:xfrm>
-                    <a:prstGeom prst="rect">
-                      <a:avLst/>
-                    </a:prstGeom>
-                    <a:noFill/>
-                    <a:ln>
-                      <a:noFill/>
-                    </a:ln>
-                  </pic:spPr>
-                </pic:pic>
-              </a:graphicData>
-            </a:graphic>
-          </wp:inline>
-        </w:drawing>
       </w:r>
     </w:p>
     <w:p>
@@ -10621,7 +11710,6 @@
           <w:rFonts w:ascii="Source Sans Pro" w:hAnsi="Source Sans Pro"/>
           <w:color w:val="373D49"/>
         </w:rPr>
-        <w:lastRenderedPageBreak/>
         <w:t>Game Rating System: Comprehensive Scoring Mechanism</w:t>
       </w:r>
     </w:p>
@@ -10703,7 +11791,115 @@
           <w:rFonts w:ascii="Courier New" w:hAnsi="Courier New" w:cs="Courier New"/>
           <w:color w:val="333333"/>
         </w:rPr>
-        <w:t>Final Score = Popularity(25%) + Quality(25%) + Engagement(20%) + Content(15%) + Accessibility(10%) + Value(5%)</w:t>
+        <w:t xml:space="preserve">Final Score = </w:t>
+      </w:r>
+      <w:proofErr w:type="gramStart"/>
+      <w:r>
+        <w:rPr>
+          <w:rStyle w:val="HTML1"/>
+          <w:rFonts w:ascii="Courier New" w:hAnsi="Courier New" w:cs="Courier New"/>
+          <w:color w:val="333333"/>
+        </w:rPr>
+        <w:t>Popularity(</w:t>
+      </w:r>
+      <w:proofErr w:type="gramEnd"/>
+      <w:r>
+        <w:rPr>
+          <w:rStyle w:val="HTML1"/>
+          <w:rFonts w:ascii="Courier New" w:hAnsi="Courier New" w:cs="Courier New"/>
+          <w:color w:val="333333"/>
+        </w:rPr>
+        <w:t xml:space="preserve">25%) + </w:t>
+      </w:r>
+      <w:proofErr w:type="gramStart"/>
+      <w:r>
+        <w:rPr>
+          <w:rStyle w:val="HTML1"/>
+          <w:rFonts w:ascii="Courier New" w:hAnsi="Courier New" w:cs="Courier New"/>
+          <w:color w:val="333333"/>
+        </w:rPr>
+        <w:t>Quality(</w:t>
+      </w:r>
+      <w:proofErr w:type="gramEnd"/>
+      <w:r>
+        <w:rPr>
+          <w:rStyle w:val="HTML1"/>
+          <w:rFonts w:ascii="Courier New" w:hAnsi="Courier New" w:cs="Courier New"/>
+          <w:color w:val="333333"/>
+        </w:rPr>
+        <w:t xml:space="preserve">25%) + </w:t>
+      </w:r>
+      <w:proofErr w:type="gramStart"/>
+      <w:r>
+        <w:rPr>
+          <w:rStyle w:val="HTML1"/>
+          <w:rFonts w:ascii="Courier New" w:hAnsi="Courier New" w:cs="Courier New"/>
+          <w:color w:val="333333"/>
+        </w:rPr>
+        <w:t>Engagement(</w:t>
+      </w:r>
+      <w:proofErr w:type="gramEnd"/>
+      <w:r>
+        <w:rPr>
+          <w:rStyle w:val="HTML1"/>
+          <w:rFonts w:ascii="Courier New" w:hAnsi="Courier New" w:cs="Courier New"/>
+          <w:color w:val="333333"/>
+        </w:rPr>
+        <w:t xml:space="preserve">20%) + </w:t>
+      </w:r>
+      <w:proofErr w:type="gramStart"/>
+      <w:r>
+        <w:rPr>
+          <w:rStyle w:val="HTML1"/>
+          <w:rFonts w:ascii="Courier New" w:hAnsi="Courier New" w:cs="Courier New"/>
+          <w:color w:val="333333"/>
+        </w:rPr>
+        <w:t>Content(</w:t>
+      </w:r>
+      <w:proofErr w:type="gramEnd"/>
+      <w:r>
+        <w:rPr>
+          <w:rStyle w:val="HTML1"/>
+          <w:rFonts w:ascii="Courier New" w:hAnsi="Courier New" w:cs="Courier New"/>
+          <w:color w:val="333333"/>
+        </w:rPr>
+        <w:t xml:space="preserve">15%) + </w:t>
+      </w:r>
+      <w:proofErr w:type="gramStart"/>
+      <w:r>
+        <w:rPr>
+          <w:rStyle w:val="HTML1"/>
+          <w:rFonts w:ascii="Courier New" w:hAnsi="Courier New" w:cs="Courier New"/>
+          <w:color w:val="333333"/>
+        </w:rPr>
+        <w:t>Accessibility(</w:t>
+      </w:r>
+      <w:proofErr w:type="gramEnd"/>
+      <w:r>
+        <w:rPr>
+          <w:rStyle w:val="HTML1"/>
+          <w:rFonts w:ascii="Courier New" w:hAnsi="Courier New" w:cs="Courier New"/>
+          <w:color w:val="333333"/>
+        </w:rPr>
+        <w:t xml:space="preserve">10%) + </w:t>
+      </w:r>
+      <w:proofErr w:type="gramStart"/>
+      <w:r>
+        <w:rPr>
+          <w:rStyle w:val="HTML1"/>
+          <w:rFonts w:ascii="Courier New" w:hAnsi="Courier New" w:cs="Courier New"/>
+          <w:color w:val="333333"/>
+        </w:rPr>
+        <w:t>Value(</w:t>
+      </w:r>
+      <w:proofErr w:type="gramEnd"/>
+      <w:r>
+        <w:rPr>
+          <w:rStyle w:val="HTML1"/>
+          <w:rFonts w:ascii="Courier New" w:hAnsi="Courier New" w:cs="Courier New"/>
+          <w:color w:val="333333"/>
+        </w:rPr>
+        <w:t>5%)</w:t>
       </w:r>
     </w:p>
     <w:p>
@@ -10826,6 +12022,7 @@
         </w:rPr>
         <w:t> (40%): </w:t>
       </w:r>
+      <w:proofErr w:type="spellStart"/>
       <w:r>
         <w:rPr>
           <w:rStyle w:val="HTML1"/>
@@ -10837,6 +12034,7 @@
         </w:rPr>
         <w:t>estimated_owners</w:t>
       </w:r>
+      <w:proofErr w:type="spellEnd"/>
       <w:r>
         <w:rPr>
           <w:rFonts w:ascii="Georgia" w:hAnsi="Georgia"/>
@@ -10927,6 +12125,7 @@
         </w:rPr>
         <w:t> (20%): </w:t>
       </w:r>
+      <w:proofErr w:type="spellStart"/>
       <w:r>
         <w:rPr>
           <w:rStyle w:val="HTML1"/>
@@ -10938,6 +12137,7 @@
         </w:rPr>
         <w:t>peak_ccu</w:t>
       </w:r>
+      <w:proofErr w:type="spellEnd"/>
       <w:r>
         <w:rPr>
           <w:rFonts w:ascii="Georgia" w:hAnsi="Georgia"/>
@@ -11035,6 +12235,7 @@
         </w:rPr>
         <w:t> (60%): </w:t>
       </w:r>
+      <w:proofErr w:type="spellStart"/>
       <w:r>
         <w:rPr>
           <w:rStyle w:val="HTML1"/>
@@ -11046,6 +12247,7 @@
         </w:rPr>
         <w:t>metacritic_score</w:t>
       </w:r>
+      <w:proofErr w:type="spellEnd"/>
       <w:r>
         <w:rPr>
           <w:rFonts w:ascii="Georgia" w:hAnsi="Georgia"/>
@@ -11252,6 +12454,7 @@
         </w:rPr>
         <w:t> (40%): </w:t>
       </w:r>
+      <w:proofErr w:type="spellStart"/>
       <w:r>
         <w:rPr>
           <w:rStyle w:val="HTML1"/>
@@ -11263,6 +12466,7 @@
         </w:rPr>
         <w:t>average_playtime_forever</w:t>
       </w:r>
+      <w:proofErr w:type="spellEnd"/>
       <w:r>
         <w:rPr>
           <w:rFonts w:ascii="Georgia" w:hAnsi="Georgia"/>
@@ -11362,6 +12566,7 @@
         </w:rPr>
         <w:t> (20%): </w:t>
       </w:r>
+      <w:proofErr w:type="spellStart"/>
       <w:r>
         <w:rPr>
           <w:rStyle w:val="HTML1"/>
@@ -11371,8 +12576,33 @@
           <w:szCs w:val="21"/>
           <w:shd w:val="clear" w:color="auto" w:fill="F9F2F4"/>
         </w:rPr>
-        <w:t>median_playtime_forever / average_playtime_forever</w:t>
-      </w:r>
+        <w:t>median_playtime_forever</w:t>
+      </w:r>
+      <w:proofErr w:type="spellEnd"/>
+      <w:r>
+        <w:rPr>
+          <w:rStyle w:val="HTML1"/>
+          <w:rFonts w:ascii="Courier New" w:hAnsi="Courier New" w:cs="Courier New"/>
+          <w:color w:val="C7254E"/>
+          <w:sz w:val="21"/>
+          <w:szCs w:val="21"/>
+          <w:shd w:val="clear" w:color="auto" w:fill="F9F2F4"/>
+        </w:rPr>
+        <w:t xml:space="preserve"> / </w:t>
+      </w:r>
+      <w:proofErr w:type="spellStart"/>
+      <w:r>
+        <w:rPr>
+          <w:rStyle w:val="HTML1"/>
+          <w:rFonts w:ascii="Courier New" w:hAnsi="Courier New" w:cs="Courier New"/>
+          <w:color w:val="C7254E"/>
+          <w:sz w:val="21"/>
+          <w:szCs w:val="21"/>
+          <w:shd w:val="clear" w:color="auto" w:fill="F9F2F4"/>
+        </w:rPr>
+        <w:t>average_playtime_forever</w:t>
+      </w:r>
+      <w:proofErr w:type="spellEnd"/>
     </w:p>
     <w:p>
       <w:pPr>
@@ -11391,6 +12621,7 @@
           <w:rFonts w:ascii="Source Sans Pro" w:hAnsi="Source Sans Pro"/>
           <w:color w:val="373D49"/>
         </w:rPr>
+        <w:lastRenderedPageBreak/>
         <w:t>4. </w:t>
       </w:r>
       <w:r>
@@ -11461,6 +12692,7 @@
         </w:rPr>
         <w:t> (30%): </w:t>
       </w:r>
+      <w:proofErr w:type="spellStart"/>
       <w:r>
         <w:rPr>
           <w:rStyle w:val="HTML1"/>
@@ -11472,6 +12704,7 @@
         </w:rPr>
         <w:t>dlc_count</w:t>
       </w:r>
+      <w:proofErr w:type="spellEnd"/>
       <w:r>
         <w:rPr>
           <w:rFonts w:ascii="Georgia" w:hAnsi="Georgia"/>
@@ -11505,7 +12738,6 @@
           <w:sz w:val="21"/>
           <w:szCs w:val="21"/>
         </w:rPr>
-        <w:lastRenderedPageBreak/>
         <w:t>Language Support</w:t>
       </w:r>
       <w:r>
@@ -11517,6 +12749,7 @@
         </w:rPr>
         <w:t> (20%): </w:t>
       </w:r>
+      <w:proofErr w:type="spellStart"/>
       <w:r>
         <w:rPr>
           <w:rStyle w:val="HTML1"/>
@@ -11528,6 +12761,7 @@
         </w:rPr>
         <w:t>supported_languages</w:t>
       </w:r>
+      <w:proofErr w:type="spellEnd"/>
       <w:r>
         <w:rPr>
           <w:rFonts w:ascii="Georgia" w:hAnsi="Georgia"/>
@@ -11779,8 +13013,21 @@
           <w:szCs w:val="21"/>
           <w:shd w:val="clear" w:color="auto" w:fill="F9F2F4"/>
         </w:rPr>
-        <w:t>1 - required_age</w:t>
-      </w:r>
+        <w:t xml:space="preserve">1 - </w:t>
+      </w:r>
+      <w:proofErr w:type="spellStart"/>
+      <w:r>
+        <w:rPr>
+          <w:rStyle w:val="HTML1"/>
+          <w:rFonts w:ascii="Courier New" w:hAnsi="Courier New" w:cs="Courier New"/>
+          <w:color w:val="C7254E"/>
+          <w:sz w:val="21"/>
+          <w:szCs w:val="21"/>
+          <w:shd w:val="clear" w:color="auto" w:fill="F9F2F4"/>
+        </w:rPr>
+        <w:t>required_age</w:t>
+      </w:r>
+      <w:proofErr w:type="spellEnd"/>
       <w:r>
         <w:rPr>
           <w:rFonts w:ascii="Georgia" w:hAnsi="Georgia"/>
@@ -12068,13 +13315,77 @@
           <w:color w:val="333333"/>
         </w:rPr>
       </w:pPr>
+      <w:proofErr w:type="spellStart"/>
       <w:r>
         <w:rPr>
           <w:rStyle w:val="HTML1"/>
           <w:rFonts w:ascii="Courier New" w:hAnsi="Courier New" w:cs="Courier New"/>
           <w:color w:val="333333"/>
         </w:rPr>
-        <w:t>normalized_score = (value - min_value) / (max_value - min_value)</w:t>
+        <w:t>normalized_score</w:t>
+      </w:r>
+      <w:proofErr w:type="spellEnd"/>
+      <w:r>
+        <w:rPr>
+          <w:rStyle w:val="HTML1"/>
+          <w:rFonts w:ascii="Courier New" w:hAnsi="Courier New" w:cs="Courier New"/>
+          <w:color w:val="333333"/>
+        </w:rPr>
+        <w:t xml:space="preserve"> = (value - </w:t>
+      </w:r>
+      <w:proofErr w:type="spellStart"/>
+      <w:r>
+        <w:rPr>
+          <w:rStyle w:val="HTML1"/>
+          <w:rFonts w:ascii="Courier New" w:hAnsi="Courier New" w:cs="Courier New"/>
+          <w:color w:val="333333"/>
+        </w:rPr>
+        <w:t>min_value</w:t>
+      </w:r>
+      <w:proofErr w:type="spellEnd"/>
+      <w:r>
+        <w:rPr>
+          <w:rStyle w:val="HTML1"/>
+          <w:rFonts w:ascii="Courier New" w:hAnsi="Courier New" w:cs="Courier New"/>
+          <w:color w:val="333333"/>
+        </w:rPr>
+        <w:t>) / (</w:t>
+      </w:r>
+      <w:proofErr w:type="spellStart"/>
+      <w:r>
+        <w:rPr>
+          <w:rStyle w:val="HTML1"/>
+          <w:rFonts w:ascii="Courier New" w:hAnsi="Courier New" w:cs="Courier New"/>
+          <w:color w:val="333333"/>
+        </w:rPr>
+        <w:t>max_value</w:t>
+      </w:r>
+      <w:proofErr w:type="spellEnd"/>
+      <w:r>
+        <w:rPr>
+          <w:rStyle w:val="HTML1"/>
+          <w:rFonts w:ascii="Courier New" w:hAnsi="Courier New" w:cs="Courier New"/>
+          <w:color w:val="333333"/>
+        </w:rPr>
+        <w:t xml:space="preserve"> - </w:t>
+      </w:r>
+      <w:proofErr w:type="spellStart"/>
+      <w:r>
+        <w:rPr>
+          <w:rStyle w:val="HTML1"/>
+          <w:rFonts w:ascii="Courier New" w:hAnsi="Courier New" w:cs="Courier New"/>
+          <w:color w:val="333333"/>
+        </w:rPr>
+        <w:t>min_value</w:t>
+      </w:r>
+      <w:proofErr w:type="spellEnd"/>
+      <w:r>
+        <w:rPr>
+          <w:rStyle w:val="HTML1"/>
+          <w:rFonts w:ascii="Courier New" w:hAnsi="Courier New" w:cs="Courier New"/>
+          <w:color w:val="333333"/>
+        </w:rPr>
+        <w:t>)</w:t>
       </w:r>
     </w:p>
     <w:p>
@@ -13055,7 +14366,7 @@
                     <pic:cNvPicPr/>
                   </pic:nvPicPr>
                   <pic:blipFill>
-                    <a:blip r:embed="rId35"/>
+                    <a:blip r:embed="rId34"/>
                     <a:stretch>
                       <a:fillRect/>
                     </a:stretch>
@@ -18132,7 +19443,6 @@
   <w:style w:type="character" w:default="1" w:styleId="a0">
     <w:name w:val="Default Paragraph Font"/>
     <w:uiPriority w:val="1"/>
-    <w:semiHidden/>
     <w:unhideWhenUsed/>
   </w:style>
   <w:style w:type="table" w:default="1" w:styleId="a1">

</xml_diff>